<commit_message>
Jan 04th Mani Project skeleton
</commit_message>
<xml_diff>
--- a/docs/KYC_Doc_AI_Review_v1.0.docx
+++ b/docs/KYC_Doc_AI_Review_v1.0.docx
@@ -4453,25 +4453,7 @@
       </w:r>
       <w:proofErr w:type="gramEnd"/>
       <w:r>
-        <w:t xml:space="preserve"> use forward slash Ex: </w:t>
-      </w:r>
-      <w:r>
-        <w:t>C:</w:t>
-      </w:r>
-      <w:r>
-        <w:t>/</w:t>
-      </w:r>
-      <w:r>
-        <w:t>HappyLearnings</w:t>
-      </w:r>
-      <w:r>
-        <w:t>/</w:t>
-      </w:r>
-      <w:r>
-        <w:t>workspace_cps</w:t>
-      </w:r>
-      <w:r>
-        <w:t>]</w:t>
+        <w:t xml:space="preserve"> use forward slash Ex: C:/HappyLearnings/workspace_cps]</w:t>
       </w:r>
     </w:p>
     <w:p>
@@ -4903,6 +4885,9 @@
         <w:pStyle w:val="ListParagraph"/>
       </w:pPr>
       <w:r>
+        <w:rPr>
+          <w:noProof/>
+        </w:rPr>
         <w:drawing>
           <wp:inline distT="0" distB="0" distL="0" distR="0" wp14:anchorId="5DB3F9F2" wp14:editId="0A06029D">
             <wp:extent cx="5943600" cy="624205"/>
@@ -4948,16 +4933,188 @@
           <w:numId w:val="38"/>
         </w:numPr>
       </w:pPr>
-      <w:r>
-        <w:t xml:space="preserve">Now access your branch in </w:t>
+      <w:proofErr w:type="gramStart"/>
+      <w:r>
+        <w:t>Now</w:t>
+      </w:r>
+      <w:proofErr w:type="gramEnd"/>
+      <w:r>
+        <w:t xml:space="preserve"> need to raise Pull request to merge this change from your feature branch to Main branch</w:t>
+      </w:r>
+    </w:p>
+    <w:p>
+      <w:pPr>
+        <w:pStyle w:val="ListParagraph"/>
+      </w:pPr>
+      <w:proofErr w:type="gramStart"/>
+      <w:r>
+        <w:t>Access :</w:t>
+      </w:r>
+      <w:proofErr w:type="gramEnd"/>
+      <w:r>
+        <w:t xml:space="preserve"> </w:t>
+      </w:r>
+      <w:hyperlink r:id="rId10" w:history="1">
+        <w:r>
+          <w:rPr>
+            <w:rStyle w:val="Hyperlink"/>
+          </w:rPr>
+          <w:t>https://github.com/javamani/gen-ai/pulls</w:t>
+        </w:r>
+      </w:hyperlink>
+    </w:p>
+    <w:p>
+      <w:pPr>
+        <w:pStyle w:val="ListParagraph"/>
+      </w:pPr>
+      <w:r>
+        <w:lastRenderedPageBreak/>
+        <w:t>Click on “new pull request” button</w:t>
+      </w:r>
+    </w:p>
+    <w:p>
+      <w:pPr>
+        <w:pStyle w:val="ListParagraph"/>
+      </w:pPr>
+      <w:r>
+        <w:t xml:space="preserve">Choose </w:t>
       </w:r>
       <w:proofErr w:type="spellStart"/>
-      <w:r>
-        <w:t>github</w:t>
+      <w:proofErr w:type="gramStart"/>
+      <w:r>
+        <w:t>base:main</w:t>
       </w:r>
       <w:proofErr w:type="spellEnd"/>
-      <w:r>
-        <w:t xml:space="preserve"> using your </w:t>
+      <w:proofErr w:type="gramEnd"/>
+      <w:r>
+        <w:t xml:space="preserve"> and compare :&lt;your feature branch&gt;</w:t>
+      </w:r>
+      <w:r>
+        <w:t xml:space="preserve"> and click on create pull request</w:t>
+      </w:r>
+    </w:p>
+    <w:p>
+      <w:pPr>
+        <w:pStyle w:val="ListParagraph"/>
+      </w:pPr>
+      <w:r>
+        <w:drawing>
+          <wp:inline distT="0" distB="0" distL="0" distR="0" wp14:anchorId="2E3B6D25" wp14:editId="55478880">
+            <wp:extent cx="5943600" cy="1534795"/>
+            <wp:effectExtent l="0" t="0" r="0" b="8255"/>
+            <wp:docPr id="201233397" name="Picture 1"/>
+            <wp:cNvGraphicFramePr>
+              <a:graphicFrameLocks xmlns:a="http://schemas.openxmlformats.org/drawingml/2006/main" noChangeAspect="1"/>
+            </wp:cNvGraphicFramePr>
+            <a:graphic xmlns:a="http://schemas.openxmlformats.org/drawingml/2006/main">
+              <a:graphicData uri="http://schemas.openxmlformats.org/drawingml/2006/picture">
+                <pic:pic xmlns:pic="http://schemas.openxmlformats.org/drawingml/2006/picture">
+                  <pic:nvPicPr>
+                    <pic:cNvPr id="201233397" name=""/>
+                    <pic:cNvPicPr/>
+                  </pic:nvPicPr>
+                  <pic:blipFill>
+                    <a:blip r:embed="rId11"/>
+                    <a:stretch>
+                      <a:fillRect/>
+                    </a:stretch>
+                  </pic:blipFill>
+                  <pic:spPr>
+                    <a:xfrm>
+                      <a:off x="0" y="0"/>
+                      <a:ext cx="5943600" cy="1534795"/>
+                    </a:xfrm>
+                    <a:prstGeom prst="rect">
+                      <a:avLst/>
+                    </a:prstGeom>
+                  </pic:spPr>
+                </pic:pic>
+              </a:graphicData>
+            </a:graphic>
+          </wp:inline>
+        </w:drawing>
+      </w:r>
+    </w:p>
+    <w:p>
+      <w:pPr>
+        <w:pStyle w:val="ListParagraph"/>
+      </w:pPr>
+    </w:p>
+    <w:p>
+      <w:pPr>
+        <w:pStyle w:val="ListParagraph"/>
+      </w:pPr>
+      <w:r>
+        <w:t xml:space="preserve">Click on “assignees” to </w:t>
+      </w:r>
+      <w:proofErr w:type="spellStart"/>
+      <w:r>
+        <w:t>javamani</w:t>
+      </w:r>
+      <w:proofErr w:type="spellEnd"/>
+    </w:p>
+    <w:p>
+      <w:pPr>
+        <w:pStyle w:val="ListParagraph"/>
+      </w:pPr>
+    </w:p>
+    <w:p>
+      <w:pPr>
+        <w:pStyle w:val="ListParagraph"/>
+      </w:pPr>
+      <w:r>
+        <w:drawing>
+          <wp:inline distT="0" distB="0" distL="0" distR="0" wp14:anchorId="4D7D3552" wp14:editId="7C0934F1">
+            <wp:extent cx="5943600" cy="3044825"/>
+            <wp:effectExtent l="0" t="0" r="0" b="3175"/>
+            <wp:docPr id="1153359949" name="Picture 1"/>
+            <wp:cNvGraphicFramePr>
+              <a:graphicFrameLocks xmlns:a="http://schemas.openxmlformats.org/drawingml/2006/main" noChangeAspect="1"/>
+            </wp:cNvGraphicFramePr>
+            <a:graphic xmlns:a="http://schemas.openxmlformats.org/drawingml/2006/main">
+              <a:graphicData uri="http://schemas.openxmlformats.org/drawingml/2006/picture">
+                <pic:pic xmlns:pic="http://schemas.openxmlformats.org/drawingml/2006/picture">
+                  <pic:nvPicPr>
+                    <pic:cNvPr id="1153359949" name=""/>
+                    <pic:cNvPicPr/>
+                  </pic:nvPicPr>
+                  <pic:blipFill>
+                    <a:blip r:embed="rId12"/>
+                    <a:stretch>
+                      <a:fillRect/>
+                    </a:stretch>
+                  </pic:blipFill>
+                  <pic:spPr>
+                    <a:xfrm>
+                      <a:off x="0" y="0"/>
+                      <a:ext cx="5943600" cy="3044825"/>
+                    </a:xfrm>
+                    <a:prstGeom prst="rect">
+                      <a:avLst/>
+                    </a:prstGeom>
+                  </pic:spPr>
+                </pic:pic>
+              </a:graphicData>
+            </a:graphic>
+          </wp:inline>
+        </w:drawing>
+      </w:r>
+    </w:p>
+    <w:p>
+      <w:pPr>
+        <w:pStyle w:val="ListParagraph"/>
+      </w:pPr>
+    </w:p>
+    <w:p>
+      <w:pPr>
+        <w:pStyle w:val="ListParagraph"/>
+        <w:numPr>
+          <w:ilvl w:val="0"/>
+          <w:numId w:val="38"/>
+        </w:numPr>
+      </w:pPr>
+      <w:r>
+        <w:t>I will review and then merge that pull request.</w:t>
       </w:r>
     </w:p>
     <w:p>
@@ -5002,1327 +5159,982 @@
         <w:rPr>
           <w:highlight w:val="yellow"/>
         </w:rPr>
+        <w:t xml:space="preserve">Master prompt to use in </w:t>
+      </w:r>
+      <w:proofErr w:type="spellStart"/>
+      <w:r>
+        <w:rPr>
+          <w:highlight w:val="yellow"/>
+        </w:rPr>
+        <w:t>Replit</w:t>
+      </w:r>
+      <w:proofErr w:type="spellEnd"/>
+    </w:p>
+    <w:p/>
+    <w:p>
+      <w:r>
+        <w:t>You are a senior full-stack AI engineer specializing in banking, compliance,</w:t>
+      </w:r>
+    </w:p>
+    <w:p>
+      <w:r>
         <w:lastRenderedPageBreak/>
-        <w:t xml:space="preserve">Master prompt to use in </w:t>
+        <w:t>and Generative AI systems.</w:t>
+      </w:r>
+    </w:p>
+    <w:p/>
+    <w:p>
+      <w:r>
+        <w:t>Build a production-grade, modular AI-driven KYC (Know Your Customer)</w:t>
+      </w:r>
+    </w:p>
+    <w:p>
+      <w:r>
+        <w:t>Document Review and Compliance Assistant with a maker–checker onboarding</w:t>
+      </w:r>
+    </w:p>
+    <w:p>
+      <w:r>
+        <w:t>workflow.</w:t>
+      </w:r>
+    </w:p>
+    <w:p/>
+    <w:p>
+      <w:r>
+        <w:t>===============================</w:t>
+      </w:r>
+    </w:p>
+    <w:p>
+      <w:r>
+        <w:rPr>
+          <w:highlight w:val="yellow"/>
+        </w:rPr>
+        <w:t>FUNCTIONAL REQUIREMENTS</w:t>
+      </w:r>
+    </w:p>
+    <w:p>
+      <w:r>
+        <w:t>===============================</w:t>
+      </w:r>
+    </w:p>
+    <w:p/>
+    <w:p>
+      <w:r>
+        <w:t>1. Implement Customer Onboarding:</w:t>
+      </w:r>
+    </w:p>
+    <w:p>
+      <w:r>
+        <w:t xml:space="preserve">   - Capture customer profile (Name, DOB, Address).</w:t>
+      </w:r>
+    </w:p>
+    <w:p>
+      <w:r>
+        <w:t xml:space="preserve">   - Upload KYC documents (PAN, Aadhaar, Passport).</w:t>
+      </w:r>
+    </w:p>
+    <w:p>
+      <w:r>
+        <w:t xml:space="preserve">   - Store cases in MongoDB.</w:t>
+      </w:r>
+    </w:p>
+    <w:p>
+      <w:r>
+        <w:t xml:space="preserve">   - Each onboarding case is created by a MAKER user.</w:t>
+      </w:r>
+    </w:p>
+    <w:p/>
+    <w:p>
+      <w:r>
+        <w:t>2. Implement Role-Based Access Control:</w:t>
+      </w:r>
+    </w:p>
+    <w:p>
+      <w:r>
+        <w:t xml:space="preserve">   - Roles: MAKER, CHECKER.</w:t>
+      </w:r>
+    </w:p>
+    <w:p>
+      <w:r>
+        <w:t xml:space="preserve">   - MAKER can create and submit KYC cases.</w:t>
+      </w:r>
+    </w:p>
+    <w:p>
+      <w:r>
+        <w:t xml:space="preserve">   - CHECKER can review, approve, or reject cases.</w:t>
+      </w:r>
+    </w:p>
+    <w:p>
+      <w:r>
+        <w:t xml:space="preserve">   - Enforce segregation of duties.</w:t>
+      </w:r>
+    </w:p>
+    <w:p/>
+    <w:p>
+      <w:r>
+        <w:t>3. Implement Lightweight Workflow Engine:</w:t>
+      </w:r>
+    </w:p>
+    <w:p>
+      <w:r>
+        <w:t xml:space="preserve">   - Case states:</w:t>
+      </w:r>
+    </w:p>
+    <w:p>
+      <w:r>
+        <w:t xml:space="preserve">     DRAFT → SUBMITTED → AI_REVIEWED → CHECKER_APPROVED / CHECKER_REJECTED</w:t>
+      </w:r>
+    </w:p>
+    <w:p>
+      <w:r>
+        <w:t xml:space="preserve">   - Validate state transitions based on role and action.</w:t>
+      </w:r>
+    </w:p>
+    <w:p>
+      <w:r>
+        <w:lastRenderedPageBreak/>
+        <w:t xml:space="preserve">   - Maintain an audit trail for all state changes.</w:t>
+      </w:r>
+    </w:p>
+    <w:p/>
+    <w:p>
+      <w:r>
+        <w:t>4. OCR &amp; Document Processing:</w:t>
+      </w:r>
+    </w:p>
+    <w:p>
+      <w:r>
+        <w:t xml:space="preserve">   - Extract text from uploaded documents using </w:t>
       </w:r>
       <w:proofErr w:type="spellStart"/>
       <w:r>
+        <w:t>PaddleOCR</w:t>
+      </w:r>
+      <w:proofErr w:type="spellEnd"/>
+      <w:r>
+        <w:t>.</w:t>
+      </w:r>
+    </w:p>
+    <w:p>
+      <w:r>
+        <w:t xml:space="preserve">   - Support scanned and photographed documents.</w:t>
+      </w:r>
+    </w:p>
+    <w:p/>
+    <w:p>
+      <w:r>
+        <w:t>5. NLP &amp; Entity Extraction:</w:t>
+      </w:r>
+    </w:p>
+    <w:p>
+      <w:r>
+        <w:t xml:space="preserve">   - Extract Name, Date of Birth, Address, PAN/Aadhaar using </w:t>
+      </w:r>
+      <w:proofErr w:type="spellStart"/>
+      <w:r>
+        <w:t>spaCy</w:t>
+      </w:r>
+      <w:proofErr w:type="spellEnd"/>
+      <w:r>
+        <w:t xml:space="preserve"> and Regex.</w:t>
+      </w:r>
+    </w:p>
+    <w:p/>
+    <w:p>
+      <w:r>
+        <w:t>6. Validation &amp; Risk Scoring:</w:t>
+      </w:r>
+    </w:p>
+    <w:p>
+      <w:r>
+        <w:t xml:space="preserve">   - Compare extracted fields with onboarding data.</w:t>
+      </w:r>
+    </w:p>
+    <w:p>
+      <w:r>
+        <w:t xml:space="preserve">   - Calculate a rule-based KYC risk score.</w:t>
+      </w:r>
+    </w:p>
+    <w:p>
+      <w:r>
+        <w:t xml:space="preserve">   - Detect anomalies (missing or inconsistent data).</w:t>
+      </w:r>
+    </w:p>
+    <w:p/>
+    <w:p>
+      <w:r>
+        <w:t>7. RAG-Based Compliance Engine:</w:t>
+      </w:r>
+    </w:p>
+    <w:p>
+      <w:r>
+        <w:t xml:space="preserve">   - Ingest RBI KYC Master Direction documents.</w:t>
+      </w:r>
+    </w:p>
+    <w:p>
+      <w:r>
+        <w:t xml:space="preserve">   - Use </w:t>
+      </w:r>
+      <w:proofErr w:type="spellStart"/>
+      <w:r>
+        <w:t>SentenceTransformers</w:t>
+      </w:r>
+      <w:proofErr w:type="spellEnd"/>
+      <w:r>
+        <w:t xml:space="preserve"> for embeddings.</w:t>
+      </w:r>
+    </w:p>
+    <w:p>
+      <w:r>
+        <w:t xml:space="preserve">   - Store vectors in FAISS.</w:t>
+      </w:r>
+    </w:p>
+    <w:p>
+      <w:r>
+        <w:t xml:space="preserve">   - Retrieve relevant compliance rules using </w:t>
+      </w:r>
+      <w:proofErr w:type="spellStart"/>
+      <w:r>
+        <w:t>LangChain</w:t>
+      </w:r>
+      <w:proofErr w:type="spellEnd"/>
+      <w:r>
+        <w:t>.</w:t>
+      </w:r>
+    </w:p>
+    <w:p/>
+    <w:p>
+      <w:r>
+        <w:t>8. GenAI Decision Explanation:</w:t>
+      </w:r>
+    </w:p>
+    <w:p>
+      <w:r>
+        <w:t xml:space="preserve">   - Use an open-source LLM (Llama / Mistral / Gemma via </w:t>
+      </w:r>
+      <w:proofErr w:type="spellStart"/>
+      <w:r>
+        <w:t>HuggingFace</w:t>
+      </w:r>
+      <w:proofErr w:type="spellEnd"/>
+      <w:r>
+        <w:t>).</w:t>
+      </w:r>
+    </w:p>
+    <w:p>
+      <w:r>
+        <w:t xml:space="preserve">   - Generate explainable AI reasoning for approval or rejection.</w:t>
+      </w:r>
+    </w:p>
+    <w:p/>
+    <w:p>
+      <w:r>
+        <w:t>9. Backend API:</w:t>
+      </w:r>
+    </w:p>
+    <w:p>
+      <w:r>
+        <w:t xml:space="preserve">   - Build REST APIs using </w:t>
+      </w:r>
+      <w:proofErr w:type="spellStart"/>
+      <w:r>
+        <w:t>FastAPI</w:t>
+      </w:r>
+      <w:proofErr w:type="spellEnd"/>
+      <w:r>
+        <w:t>.</w:t>
+      </w:r>
+    </w:p>
+    <w:p>
+      <w:r>
+        <w:lastRenderedPageBreak/>
+        <w:t xml:space="preserve">   - Use MongoDB for persistence.</w:t>
+      </w:r>
+    </w:p>
+    <w:p>
+      <w:r>
+        <w:t xml:space="preserve">   - Modular, service-based architecture.</w:t>
+      </w:r>
+    </w:p>
+    <w:p>
+      <w:r>
+        <w:t xml:space="preserve">   - Environment variable support.</w:t>
+      </w:r>
+    </w:p>
+    <w:p>
+      <w:r>
+        <w:t xml:space="preserve">   - Error handling and logging.</w:t>
+      </w:r>
+    </w:p>
+    <w:p/>
+    <w:p>
+      <w:r>
+        <w:t>===============================</w:t>
+      </w:r>
+    </w:p>
+    <w:p>
+      <w:r>
         <w:rPr>
           <w:highlight w:val="yellow"/>
         </w:rPr>
-        <w:t>Replit</w:t>
+        <w:t>FRONTEND REQUIREMENTS (REACT)</w:t>
+      </w:r>
+    </w:p>
+    <w:p>
+      <w:r>
+        <w:t>===============================</w:t>
+      </w:r>
+    </w:p>
+    <w:p/>
+    <w:p>
+      <w:r>
+        <w:t>- React frontend with:</w:t>
+      </w:r>
+    </w:p>
+    <w:p>
+      <w:r>
+        <w:t xml:space="preserve">  - Login screen (Maker / Checker).</w:t>
+      </w:r>
+    </w:p>
+    <w:p>
+      <w:r>
+        <w:t xml:space="preserve">  - Maker dashboard:</w:t>
+      </w:r>
+    </w:p>
+    <w:p>
+      <w:r>
+        <w:t xml:space="preserve">    - Create KYC case.</w:t>
+      </w:r>
+    </w:p>
+    <w:p>
+      <w:r>
+        <w:t xml:space="preserve">    - Upload documents.</w:t>
+      </w:r>
+    </w:p>
+    <w:p>
+      <w:r>
+        <w:t xml:space="preserve">    - Submit case for review.</w:t>
+      </w:r>
+    </w:p>
+    <w:p>
+      <w:r>
+        <w:t xml:space="preserve">    - View case status.</w:t>
+      </w:r>
+    </w:p>
+    <w:p>
+      <w:r>
+        <w:t xml:space="preserve">  - Checker dashboard:</w:t>
+      </w:r>
+    </w:p>
+    <w:p>
+      <w:r>
+        <w:t xml:space="preserve">    - View submitted cases.</w:t>
+      </w:r>
+    </w:p>
+    <w:p>
+      <w:r>
+        <w:t xml:space="preserve">    - Review AI-extracted data.</w:t>
+      </w:r>
+    </w:p>
+    <w:p>
+      <w:r>
+        <w:t xml:space="preserve">    - View risk score and GenAI explanation.</w:t>
+      </w:r>
+    </w:p>
+    <w:p>
+      <w:r>
+        <w:t xml:space="preserve">    - Approve or reject cases.</w:t>
+      </w:r>
+    </w:p>
+    <w:p>
+      <w:r>
+        <w:t xml:space="preserve">  - Status tracking and audit history.</w:t>
+      </w:r>
+    </w:p>
+    <w:p/>
+    <w:p>
+      <w:r>
+        <w:t>===============================</w:t>
+      </w:r>
+    </w:p>
+    <w:p>
+      <w:r>
+        <w:rPr>
+          <w:highlight w:val="yellow"/>
+        </w:rPr>
+        <w:t>TECH STACK (STRICT)</w:t>
+      </w:r>
+    </w:p>
+    <w:p>
+      <w:r>
+        <w:t>===============================</w:t>
+      </w:r>
+    </w:p>
+    <w:p/>
+    <w:p>
+      <w:r>
+        <w:t xml:space="preserve">OCR: </w:t>
+      </w:r>
+      <w:proofErr w:type="spellStart"/>
+      <w:r>
+        <w:t>PaddleOCR</w:t>
       </w:r>
       <w:proofErr w:type="spellEnd"/>
+      <w:r>
+        <w:t xml:space="preserve">  </w:t>
+      </w:r>
+    </w:p>
+    <w:p>
+      <w:r>
+        <w:t xml:space="preserve">NLP: </w:t>
+      </w:r>
+      <w:proofErr w:type="spellStart"/>
+      <w:r>
+        <w:t>spaCy</w:t>
+      </w:r>
+      <w:proofErr w:type="spellEnd"/>
+      <w:r>
+        <w:t xml:space="preserve">, Regex  </w:t>
+      </w:r>
+    </w:p>
+    <w:p>
+      <w:r>
+        <w:t xml:space="preserve">Embeddings: </w:t>
+      </w:r>
+      <w:proofErr w:type="spellStart"/>
+      <w:r>
+        <w:t>SentenceTransformers</w:t>
+      </w:r>
+      <w:proofErr w:type="spellEnd"/>
+      <w:r>
+        <w:t xml:space="preserve">  </w:t>
+      </w:r>
+    </w:p>
+    <w:p>
+      <w:r>
+        <w:t xml:space="preserve">Vector DB: FAISS  </w:t>
+      </w:r>
+    </w:p>
+    <w:p>
+      <w:r>
+        <w:t xml:space="preserve">LLM: </w:t>
+      </w:r>
+      <w:proofErr w:type="spellStart"/>
+      <w:r>
+        <w:t>HuggingFace</w:t>
+      </w:r>
+      <w:proofErr w:type="spellEnd"/>
+      <w:r>
+        <w:t xml:space="preserve"> (Llama / Mistral / Gemma)  </w:t>
+      </w:r>
+    </w:p>
+    <w:p>
+      <w:r>
+        <w:t xml:space="preserve">RAG: </w:t>
+      </w:r>
+      <w:proofErr w:type="spellStart"/>
+      <w:r>
+        <w:t>LangChain</w:t>
+      </w:r>
+      <w:proofErr w:type="spellEnd"/>
+      <w:r>
+        <w:t xml:space="preserve">  </w:t>
+      </w:r>
+    </w:p>
+    <w:p>
+      <w:r>
+        <w:t xml:space="preserve">Backend: </w:t>
+      </w:r>
+      <w:proofErr w:type="spellStart"/>
+      <w:r>
+        <w:t>FastAPI</w:t>
+      </w:r>
+      <w:proofErr w:type="spellEnd"/>
+      <w:r>
+        <w:t xml:space="preserve">  </w:t>
+      </w:r>
+    </w:p>
+    <w:p>
+      <w:r>
+        <w:t xml:space="preserve">Frontend: React  </w:t>
+      </w:r>
+    </w:p>
+    <w:p>
+      <w:r>
+        <w:t xml:space="preserve">Database: MongoDB  </w:t>
+      </w:r>
     </w:p>
     <w:p/>
     <w:p>
       <w:r>
-        <w:t>You are a senior full-stack AI engineer specializing in banking, compliance,</w:t>
-      </w:r>
-    </w:p>
-    <w:p>
-      <w:r>
-        <w:t>and Generative AI systems.</w:t>
+        <w:t>===============================</w:t>
+      </w:r>
+    </w:p>
+    <w:p>
+      <w:r>
+        <w:t>DELIVERABLES</w:t>
+      </w:r>
+    </w:p>
+    <w:p>
+      <w:r>
+        <w:t>===============================</w:t>
       </w:r>
     </w:p>
     <w:p/>
     <w:p>
       <w:r>
-        <w:t>Build a production-grade, modular AI-driven KYC (Know Your Customer)</w:t>
-      </w:r>
-    </w:p>
-    <w:p>
-      <w:r>
-        <w:t>Document Review and Compliance Assistant with a maker–checker onboarding</w:t>
-      </w:r>
-    </w:p>
-    <w:p>
-      <w:r>
-        <w:t>workflow.</w:t>
+        <w:t>1. Complete project folder structure.</w:t>
+      </w:r>
+    </w:p>
+    <w:p>
+      <w:r>
+        <w:t>2. Starter code for:</w:t>
+      </w:r>
+    </w:p>
+    <w:p>
+      <w:r>
+        <w:t xml:space="preserve">   - Authentication &amp; role management</w:t>
+      </w:r>
+    </w:p>
+    <w:p>
+      <w:r>
+        <w:t xml:space="preserve">   - Onboarding module</w:t>
+      </w:r>
+    </w:p>
+    <w:p>
+      <w:r>
+        <w:t xml:space="preserve">   - Workflow engine</w:t>
+      </w:r>
+    </w:p>
+    <w:p>
+      <w:r>
+        <w:t xml:space="preserve">   - OCR module</w:t>
+      </w:r>
+    </w:p>
+    <w:p>
+      <w:r>
+        <w:t xml:space="preserve">   - NLP entity extraction</w:t>
+      </w:r>
+    </w:p>
+    <w:p>
+      <w:r>
+        <w:t xml:space="preserve">   - Risk scoring</w:t>
+      </w:r>
+    </w:p>
+    <w:p>
+      <w:r>
+        <w:t xml:space="preserve">   - RAG compliance engine</w:t>
+      </w:r>
+    </w:p>
+    <w:p>
+      <w:r>
+        <w:t xml:space="preserve">   - GenAI explanation</w:t>
+      </w:r>
+    </w:p>
+    <w:p>
+      <w:r>
+        <w:t xml:space="preserve">   - MongoDB persistence</w:t>
+      </w:r>
+    </w:p>
+    <w:p>
+      <w:r>
+        <w:lastRenderedPageBreak/>
+        <w:t>3. React component structure for Maker and Checker dashboards.</w:t>
+      </w:r>
+    </w:p>
+    <w:p>
+      <w:r>
+        <w:t>4. API contracts between frontend and backend.</w:t>
+      </w:r>
+    </w:p>
+    <w:p>
+      <w:r>
+        <w:t>5. Clear comments explaining each module.</w:t>
+      </w:r>
+    </w:p>
+    <w:p>
+      <w:r>
+        <w:t>6. Code written in a clean, readable, college-safe manner.</w:t>
       </w:r>
     </w:p>
     <w:p/>
     <w:p>
       <w:r>
-        <w:t>===============================</w:t>
-      </w:r>
-    </w:p>
-    <w:p>
-      <w:r>
-        <w:rPr>
-          <w:highlight w:val="yellow"/>
-        </w:rPr>
-        <w:t>FUNCTIONAL REQUIREMENTS</w:t>
-      </w:r>
-    </w:p>
-    <w:p>
-      <w:r>
-        <w:t>===============================</w:t>
-      </w:r>
-    </w:p>
-    <w:p/>
-    <w:p>
-      <w:r>
-        <w:t>1. Implement Customer Onboarding:</w:t>
-      </w:r>
-    </w:p>
-    <w:p>
-      <w:r>
-        <w:t xml:space="preserve">   - Capture customer profile (Name, DOB, Address).</w:t>
-      </w:r>
-    </w:p>
-    <w:p>
-      <w:r>
-        <w:t xml:space="preserve">   - Upload KYC documents (PAN, Aadhaar, Passport).</w:t>
-      </w:r>
-    </w:p>
-    <w:p>
-      <w:r>
-        <w:t xml:space="preserve">   - Store cases in MongoDB.</w:t>
-      </w:r>
-    </w:p>
-    <w:p>
-      <w:r>
-        <w:t xml:space="preserve">   - Each onboarding case is created by a MAKER user.</w:t>
-      </w:r>
-    </w:p>
-    <w:p/>
-    <w:p>
-      <w:r>
-        <w:t>2. Implement Role-Based Access Control:</w:t>
-      </w:r>
-    </w:p>
-    <w:p>
-      <w:r>
-        <w:t xml:space="preserve">   - Roles: MAKER, CHECKER.</w:t>
-      </w:r>
-    </w:p>
-    <w:p>
-      <w:r>
-        <w:t xml:space="preserve">   - MAKER can create and submit KYC cases.</w:t>
-      </w:r>
-    </w:p>
-    <w:p>
-      <w:r>
-        <w:t xml:space="preserve">   - CHECKER can review, approve, or reject cases.</w:t>
-      </w:r>
-    </w:p>
-    <w:p>
-      <w:r>
-        <w:t xml:space="preserve">   - Enforce segregation of duties.</w:t>
-      </w:r>
-    </w:p>
-    <w:p/>
-    <w:p>
-      <w:r>
-        <w:t>3. Implement Lightweight Workflow Engine:</w:t>
-      </w:r>
-    </w:p>
-    <w:p>
-      <w:r>
-        <w:lastRenderedPageBreak/>
-        <w:t xml:space="preserve">   - Case states:</w:t>
-      </w:r>
-    </w:p>
-    <w:p>
-      <w:r>
-        <w:t xml:space="preserve">     DRAFT → SUBMITTED → AI_REVIEWED → CHECKER_APPROVED / CHECKER_REJECTED</w:t>
-      </w:r>
-    </w:p>
-    <w:p>
-      <w:r>
-        <w:t xml:space="preserve">   - Validate state transitions based on role and action.</w:t>
-      </w:r>
-    </w:p>
-    <w:p>
-      <w:r>
-        <w:t xml:space="preserve">   - Maintain an audit trail for all state changes.</w:t>
-      </w:r>
-    </w:p>
-    <w:p/>
-    <w:p>
-      <w:r>
-        <w:t>4. OCR &amp; Document Processing:</w:t>
-      </w:r>
-    </w:p>
-    <w:p>
-      <w:r>
-        <w:t xml:space="preserve">   - Extract text from uploaded documents using </w:t>
-      </w:r>
-      <w:proofErr w:type="spellStart"/>
-      <w:r>
-        <w:t>PaddleOCR</w:t>
-      </w:r>
-      <w:proofErr w:type="spellEnd"/>
-      <w:r>
-        <w:t>.</w:t>
-      </w:r>
-    </w:p>
-    <w:p>
-      <w:r>
-        <w:t xml:space="preserve">   - Support scanned and photographed documents.</w:t>
-      </w:r>
-    </w:p>
-    <w:p/>
-    <w:p>
-      <w:r>
-        <w:t>5. NLP &amp; Entity Extraction:</w:t>
-      </w:r>
-    </w:p>
-    <w:p>
-      <w:r>
-        <w:t xml:space="preserve">   - Extract Name, Date of Birth, Address, PAN/Aadhaar using </w:t>
-      </w:r>
-      <w:proofErr w:type="spellStart"/>
-      <w:r>
-        <w:t>spaCy</w:t>
-      </w:r>
-      <w:proofErr w:type="spellEnd"/>
-      <w:r>
-        <w:t xml:space="preserve"> and Regex.</w:t>
-      </w:r>
-    </w:p>
-    <w:p/>
-    <w:p>
-      <w:r>
-        <w:t>6. Validation &amp; Risk Scoring:</w:t>
-      </w:r>
-    </w:p>
-    <w:p>
-      <w:r>
-        <w:t xml:space="preserve">   - Compare extracted fields with onboarding data.</w:t>
-      </w:r>
-    </w:p>
-    <w:p>
-      <w:r>
-        <w:t xml:space="preserve">   - Calculate a rule-based KYC risk score.</w:t>
-      </w:r>
-    </w:p>
-    <w:p>
-      <w:r>
-        <w:t xml:space="preserve">   - Detect anomalies (missing or inconsistent data).</w:t>
-      </w:r>
-    </w:p>
-    <w:p/>
-    <w:p>
-      <w:r>
-        <w:t>7. RAG-Based Compliance Engine:</w:t>
-      </w:r>
-    </w:p>
-    <w:p>
-      <w:r>
-        <w:t xml:space="preserve">   - Ingest RBI KYC Master Direction documents.</w:t>
-      </w:r>
-    </w:p>
-    <w:p>
-      <w:r>
-        <w:t xml:space="preserve">   - Use </w:t>
-      </w:r>
-      <w:proofErr w:type="spellStart"/>
-      <w:r>
-        <w:t>SentenceTransformers</w:t>
-      </w:r>
-      <w:proofErr w:type="spellEnd"/>
-      <w:r>
-        <w:t xml:space="preserve"> for embeddings.</w:t>
-      </w:r>
-    </w:p>
-    <w:p>
-      <w:r>
-        <w:t xml:space="preserve">   - Store vectors in FAISS.</w:t>
-      </w:r>
-    </w:p>
-    <w:p>
-      <w:r>
-        <w:t xml:space="preserve">   - Retrieve relevant compliance rules using </w:t>
-      </w:r>
-      <w:proofErr w:type="spellStart"/>
-      <w:r>
-        <w:t>LangChain</w:t>
-      </w:r>
-      <w:proofErr w:type="spellEnd"/>
-      <w:r>
-        <w:t>.</w:t>
-      </w:r>
-    </w:p>
-    <w:p/>
-    <w:p>
-      <w:r>
-        <w:t>8. GenAI Decision Explanation:</w:t>
-      </w:r>
-    </w:p>
-    <w:p>
-      <w:r>
-        <w:t xml:space="preserve">   - Use an open-source LLM (Llama / Mistral / Gemma via </w:t>
-      </w:r>
-      <w:proofErr w:type="spellStart"/>
-      <w:r>
-        <w:t>HuggingFace</w:t>
-      </w:r>
-      <w:proofErr w:type="spellEnd"/>
-      <w:r>
-        <w:t>).</w:t>
-      </w:r>
-    </w:p>
-    <w:p>
-      <w:r>
-        <w:t xml:space="preserve">   - Generate explainable AI reasoning for approval or rejection.</w:t>
-      </w:r>
-    </w:p>
-    <w:p/>
-    <w:p>
-      <w:r>
-        <w:t>9. Backend API:</w:t>
-      </w:r>
-    </w:p>
-    <w:p>
-      <w:r>
-        <w:t xml:space="preserve">   - Build REST APIs using </w:t>
-      </w:r>
-      <w:proofErr w:type="spellStart"/>
-      <w:r>
-        <w:t>FastAPI</w:t>
-      </w:r>
-      <w:proofErr w:type="spellEnd"/>
-      <w:r>
-        <w:t>.</w:t>
-      </w:r>
-    </w:p>
-    <w:p>
-      <w:r>
-        <w:t xml:space="preserve">   - Use MongoDB for persistence.</w:t>
-      </w:r>
-    </w:p>
-    <w:p>
-      <w:r>
-        <w:t xml:space="preserve">   - Modular, service-based architecture.</w:t>
-      </w:r>
-    </w:p>
-    <w:p>
-      <w:r>
-        <w:t xml:space="preserve">   - Environment variable support.</w:t>
-      </w:r>
-    </w:p>
-    <w:p>
-      <w:r>
-        <w:t xml:space="preserve">   - Error handling and logging.</w:t>
-      </w:r>
-    </w:p>
-    <w:p/>
-    <w:p>
-      <w:r>
-        <w:t>===============================</w:t>
-      </w:r>
-    </w:p>
-    <w:p>
-      <w:r>
-        <w:rPr>
-          <w:highlight w:val="yellow"/>
-        </w:rPr>
-        <w:t>FRONTEND REQUIREMENTS (REACT)</w:t>
-      </w:r>
-    </w:p>
-    <w:p>
-      <w:r>
-        <w:t>===============================</w:t>
-      </w:r>
-    </w:p>
-    <w:p/>
-    <w:p>
-      <w:r>
-        <w:t>- React frontend with:</w:t>
-      </w:r>
-    </w:p>
-    <w:p>
-      <w:r>
-        <w:t xml:space="preserve">  - Login screen (Maker / Checker).</w:t>
-      </w:r>
-    </w:p>
-    <w:p>
-      <w:r>
-        <w:t xml:space="preserve">  - Maker dashboard:</w:t>
-      </w:r>
-    </w:p>
-    <w:p>
-      <w:r>
-        <w:t xml:space="preserve">    - Create KYC case.</w:t>
-      </w:r>
-    </w:p>
-    <w:p>
-      <w:r>
-        <w:t xml:space="preserve">    - Upload documents.</w:t>
-      </w:r>
-    </w:p>
-    <w:p>
-      <w:r>
-        <w:t xml:space="preserve">    - Submit case for review.</w:t>
-      </w:r>
-    </w:p>
-    <w:p>
-      <w:r>
-        <w:t xml:space="preserve">    - View case status.</w:t>
-      </w:r>
-    </w:p>
-    <w:p>
-      <w:r>
-        <w:t xml:space="preserve">  - Checker dashboard:</w:t>
-      </w:r>
-    </w:p>
-    <w:p>
-      <w:r>
-        <w:t xml:space="preserve">    - View submitted cases.</w:t>
-      </w:r>
-    </w:p>
-    <w:p>
-      <w:r>
-        <w:t xml:space="preserve">    - Review AI-extracted data.</w:t>
-      </w:r>
-    </w:p>
-    <w:p>
-      <w:r>
-        <w:t xml:space="preserve">    - View risk score and GenAI explanation.</w:t>
-      </w:r>
-    </w:p>
-    <w:p>
-      <w:r>
-        <w:t xml:space="preserve">    - Approve or reject cases.</w:t>
-      </w:r>
-    </w:p>
-    <w:p>
-      <w:r>
-        <w:t xml:space="preserve">  - Status tracking and audit history.</w:t>
-      </w:r>
-    </w:p>
-    <w:p/>
-    <w:p>
-      <w:r>
-        <w:lastRenderedPageBreak/>
-        <w:t>===============================</w:t>
-      </w:r>
-    </w:p>
-    <w:p>
-      <w:r>
-        <w:rPr>
-          <w:highlight w:val="yellow"/>
-        </w:rPr>
-        <w:t>TECH STACK (STRICT)</w:t>
-      </w:r>
-    </w:p>
-    <w:p>
-      <w:r>
-        <w:t>===============================</w:t>
-      </w:r>
-    </w:p>
-    <w:p/>
-    <w:p>
-      <w:r>
-        <w:t xml:space="preserve">OCR: </w:t>
-      </w:r>
-      <w:proofErr w:type="spellStart"/>
-      <w:r>
-        <w:t>PaddleOCR</w:t>
-      </w:r>
-      <w:proofErr w:type="spellEnd"/>
-      <w:r>
-        <w:t xml:space="preserve">  </w:t>
-      </w:r>
-    </w:p>
-    <w:p>
-      <w:r>
-        <w:t xml:space="preserve">NLP: </w:t>
-      </w:r>
-      <w:proofErr w:type="spellStart"/>
-      <w:r>
-        <w:t>spaCy</w:t>
-      </w:r>
-      <w:proofErr w:type="spellEnd"/>
-      <w:r>
-        <w:t xml:space="preserve">, Regex  </w:t>
-      </w:r>
-    </w:p>
-    <w:p>
-      <w:r>
-        <w:t xml:space="preserve">Embeddings: </w:t>
-      </w:r>
-      <w:proofErr w:type="spellStart"/>
-      <w:r>
-        <w:t>SentenceTransformers</w:t>
-      </w:r>
-      <w:proofErr w:type="spellEnd"/>
-      <w:r>
-        <w:t xml:space="preserve">  </w:t>
-      </w:r>
-    </w:p>
-    <w:p>
-      <w:r>
-        <w:t xml:space="preserve">Vector DB: FAISS  </w:t>
-      </w:r>
-    </w:p>
-    <w:p>
-      <w:r>
-        <w:t xml:space="preserve">LLM: </w:t>
-      </w:r>
-      <w:proofErr w:type="spellStart"/>
-      <w:r>
-        <w:t>HuggingFace</w:t>
-      </w:r>
-      <w:proofErr w:type="spellEnd"/>
-      <w:r>
-        <w:t xml:space="preserve"> (Llama / Mistral / Gemma)  </w:t>
-      </w:r>
-    </w:p>
-    <w:p>
-      <w:r>
-        <w:t xml:space="preserve">RAG: </w:t>
-      </w:r>
-      <w:proofErr w:type="spellStart"/>
-      <w:r>
-        <w:t>LangChain</w:t>
-      </w:r>
-      <w:proofErr w:type="spellEnd"/>
-      <w:r>
-        <w:t xml:space="preserve">  </w:t>
-      </w:r>
-    </w:p>
-    <w:p>
-      <w:r>
-        <w:t xml:space="preserve">Backend: </w:t>
-      </w:r>
-      <w:proofErr w:type="spellStart"/>
-      <w:r>
-        <w:t>FastAPI</w:t>
-      </w:r>
-      <w:proofErr w:type="spellEnd"/>
-      <w:r>
-        <w:t xml:space="preserve">  </w:t>
-      </w:r>
-    </w:p>
-    <w:p>
-      <w:r>
-        <w:t xml:space="preserve">Frontend: React  </w:t>
-      </w:r>
-    </w:p>
-    <w:p>
-      <w:r>
-        <w:t xml:space="preserve">Database: MongoDB  </w:t>
-      </w:r>
-    </w:p>
-    <w:p/>
-    <w:p>
-      <w:r>
-        <w:t>===============================</w:t>
-      </w:r>
-    </w:p>
-    <w:p>
-      <w:r>
-        <w:t>DELIVERABLES</w:t>
-      </w:r>
-    </w:p>
-    <w:p>
-      <w:r>
-        <w:t>===============================</w:t>
-      </w:r>
-    </w:p>
-    <w:p/>
-    <w:p>
-      <w:r>
-        <w:t>1. Complete project folder structure.</w:t>
-      </w:r>
-    </w:p>
-    <w:p>
-      <w:r>
-        <w:t>2. Starter code for:</w:t>
-      </w:r>
-    </w:p>
-    <w:p>
-      <w:r>
-        <w:t xml:space="preserve">   - Authentication &amp; role management</w:t>
-      </w:r>
-    </w:p>
-    <w:p>
-      <w:r>
-        <w:t xml:space="preserve">   - Onboarding module</w:t>
-      </w:r>
-    </w:p>
-    <w:p>
-      <w:r>
-        <w:t xml:space="preserve">   - Workflow engine</w:t>
-      </w:r>
-    </w:p>
-    <w:p>
-      <w:r>
-        <w:t xml:space="preserve">   - OCR module</w:t>
-      </w:r>
-    </w:p>
-    <w:p>
-      <w:r>
-        <w:t xml:space="preserve">   - NLP entity extraction</w:t>
-      </w:r>
-    </w:p>
-    <w:p>
-      <w:r>
-        <w:t xml:space="preserve">   - Risk scoring</w:t>
-      </w:r>
-    </w:p>
-    <w:p>
-      <w:r>
-        <w:lastRenderedPageBreak/>
-        <w:t xml:space="preserve">   - RAG compliance engine</w:t>
-      </w:r>
-    </w:p>
-    <w:p>
-      <w:r>
-        <w:t xml:space="preserve">   - GenAI explanation</w:t>
-      </w:r>
-    </w:p>
-    <w:p>
-      <w:r>
-        <w:t xml:space="preserve">   - MongoDB persistence</w:t>
-      </w:r>
-    </w:p>
-    <w:p>
-      <w:r>
-        <w:t>3. React component structure for Maker and Checker dashboards.</w:t>
-      </w:r>
-    </w:p>
-    <w:p>
-      <w:r>
-        <w:t>4. API contracts between frontend and backend.</w:t>
-      </w:r>
-    </w:p>
-    <w:p>
-      <w:r>
-        <w:t>5. Clear comments explaining each module.</w:t>
-      </w:r>
-    </w:p>
-    <w:p>
-      <w:r>
-        <w:t>6. Code written in a clean, readable, college-safe manner.</w:t>
-      </w:r>
-    </w:p>
-    <w:p/>
-    <w:p>
-      <w:r>
         <w:t>Start by generating the full folder structure,</w:t>
       </w:r>
     </w:p>
     <w:p>
       <w:r>
         <w:t>then provide starter code for each module.</w:t>
-      </w:r>
-    </w:p>
-    <w:p/>
-    <w:p>
-      <w:pPr>
-        <w:pBdr>
-          <w:bottom w:val="dotted" w:sz="24" w:space="1" w:color="auto"/>
-        </w:pBdr>
-      </w:pPr>
-    </w:p>
-    <w:p>
-      <w:r>
-        <w:t>C:\Users\aarav\OneDrive\Desktop\Professional_Docs\Divi_FinalYear_Project</w:t>
-      </w:r>
-    </w:p>
-    <w:p/>
-    <w:p>
-      <w:r>
-        <w:t>C:/Users/aarav/OneDrive/Desktop/Professional_Docs/Divi_FinalYear_Project</w:t>
-      </w:r>
-    </w:p>
-    <w:p/>
-    <w:p>
-      <w:r>
-        <w:t>https:\\github.com\</w:t>
-      </w:r>
-      <w:proofErr w:type="spellStart"/>
-      <w:r>
-        <w:t>javamani</w:t>
-      </w:r>
-      <w:proofErr w:type="spellEnd"/>
-      <w:r>
-        <w:t>\gen-</w:t>
-      </w:r>
-      <w:proofErr w:type="spellStart"/>
-      <w:r>
-        <w:t>ai.git</w:t>
-      </w:r>
-      <w:proofErr w:type="spellEnd"/>
-    </w:p>
-    <w:p/>
-    <w:p>
-      <w:r>
-        <w:t>C:/Users/aarav/OneDrive/Desktop/Professional_Docs/Divi_FinalYear_Project/GenAI_Learings</w:t>
       </w:r>
     </w:p>
     <w:p/>
     <w:p/>
-    <w:p>
-      <w:r>
-        <w:t>You are a senior full-stack AI engineer specializing in banking, compliance,</w:t>
-      </w:r>
-    </w:p>
-    <w:p>
-      <w:r>
-        <w:t>and Generative AI systems.</w:t>
-      </w:r>
-    </w:p>
     <w:p/>
     <w:p>
       <w:r>
-        <w:t>Build a production-grade, modular AI-driven KYC (Know Your Customer)</w:t>
+        <w:t>********</w:t>
+      </w:r>
+    </w:p>
+    <w:p>
+      <w:r>
+        <w:rPr>
+          <w:rFonts w:ascii="Segoe UI Emoji" w:hAnsi="Segoe UI Emoji" w:cs="Segoe UI Emoji"/>
+        </w:rPr>
+        <w:t>👥</w:t>
+      </w:r>
+      <w:r>
+        <w:t xml:space="preserve"> TEAM SPLIT (IMPORTANT)</w:t>
+      </w:r>
+    </w:p>
+    <w:p>
+      <w:r>
+        <w:t>Member</w:t>
+      </w:r>
+      <w:r>
+        <w:tab/>
+        <w:t>Responsibility</w:t>
+      </w:r>
+    </w:p>
+    <w:p>
+      <w:r>
+        <w:t>Member 1</w:t>
+      </w:r>
+      <w:r>
+        <w:tab/>
+        <w:t>OCR + NLP</w:t>
+      </w:r>
+      <w:r>
+        <w:t xml:space="preserve"> (divi)</w:t>
+      </w:r>
+    </w:p>
+    <w:p>
+      <w:r>
+        <w:t>Member 2</w:t>
+      </w:r>
+      <w:r>
+        <w:tab/>
+        <w:t>Onboarding + Workflow + Risk</w:t>
+      </w:r>
+      <w:r>
+        <w:t xml:space="preserve"> (Mani)</w:t>
+      </w:r>
+    </w:p>
+    <w:p>
+      <w:r>
+        <w:t>Member 3</w:t>
+      </w:r>
+      <w:r>
+        <w:tab/>
+        <w:t>RAG + GenAI + React</w:t>
+      </w:r>
+      <w:r>
+        <w:t xml:space="preserve"> (Guhan)</w:t>
+      </w:r>
+    </w:p>
+    <w:p/>
+    <w:p>
+      <w:r>
+        <w:t>Each member creates their own GitHub branch.</w:t>
+      </w:r>
+    </w:p>
+    <w:p/>
+    <w:p>
+      <w:r>
+        <w:rPr>
+          <w:rFonts w:ascii="Segoe UI Emoji" w:hAnsi="Segoe UI Emoji" w:cs="Segoe UI Emoji"/>
+        </w:rPr>
+        <w:t>👤</w:t>
+      </w:r>
+      <w:r>
+        <w:t xml:space="preserve"> MEMBER 1 PROMPTS (OCR + NLP)</w:t>
+      </w:r>
+    </w:p>
+    <w:p>
+      <w:r>
+        <w:rPr>
+          <w:rFonts w:ascii="Segoe UI Emoji" w:hAnsi="Segoe UI Emoji" w:cs="Segoe UI Emoji"/>
+        </w:rPr>
+        <w:t>🔹</w:t>
+      </w:r>
+      <w:r>
+        <w:t xml:space="preserve"> Prompt 2A – OCR Module</w:t>
+      </w:r>
+    </w:p>
+    <w:p>
+      <w:r>
+        <w:t xml:space="preserve">Implement a backend OCR module using </w:t>
+      </w:r>
+      <w:proofErr w:type="spellStart"/>
+      <w:r>
+        <w:t>PaddleOCR</w:t>
+      </w:r>
+      <w:proofErr w:type="spellEnd"/>
+    </w:p>
+    <w:p>
+      <w:r>
+        <w:t xml:space="preserve">inside the existing </w:t>
+      </w:r>
+      <w:proofErr w:type="spellStart"/>
+      <w:r>
+        <w:t>FastAPI</w:t>
+      </w:r>
+      <w:proofErr w:type="spellEnd"/>
+      <w:r>
+        <w:t xml:space="preserve"> project.</w:t>
+      </w:r>
+    </w:p>
+    <w:p/>
+    <w:p>
+      <w:r>
+        <w:t>Requirements:</w:t>
+      </w:r>
+    </w:p>
+    <w:p>
+      <w:r>
+        <w:t>- Accept image/PDF uploads</w:t>
       </w:r>
     </w:p>
     <w:p>
       <w:r>
         <w:lastRenderedPageBreak/>
-        <w:t>Document Review and Compliance Assistant with a maker–checker onboarding</w:t>
-      </w:r>
-    </w:p>
-    <w:p>
-      <w:r>
-        <w:t>workflow.</w:t>
+        <w:t>- Extract raw text</w:t>
+      </w:r>
+    </w:p>
+    <w:p>
+      <w:r>
+        <w:t>- Return structured JSON</w:t>
+      </w:r>
+    </w:p>
+    <w:p>
+      <w:r>
+        <w:t>- No frontend code</w:t>
+      </w:r>
+    </w:p>
+    <w:p>
+      <w:r>
+        <w:t>- Add clear comments</w:t>
       </w:r>
     </w:p>
     <w:p/>
     <w:p>
       <w:r>
-        <w:t>===============================</w:t>
-      </w:r>
-    </w:p>
-    <w:p>
-      <w:r>
-        <w:t>FUNCTIONAL REQUIREMENTS</w:t>
-      </w:r>
-    </w:p>
-    <w:p>
-      <w:r>
-        <w:t>===============================</w:t>
+        <w:rPr>
+          <w:rFonts w:ascii="Segoe UI Emoji" w:hAnsi="Segoe UI Emoji" w:cs="Segoe UI Emoji"/>
+        </w:rPr>
+        <w:t>🔹</w:t>
+      </w:r>
+      <w:r>
+        <w:t xml:space="preserve"> Prompt 2B – NLP Module</w:t>
+      </w:r>
+    </w:p>
+    <w:p>
+      <w:r>
+        <w:t xml:space="preserve">Implement entity extraction using </w:t>
+      </w:r>
+      <w:proofErr w:type="spellStart"/>
+      <w:r>
+        <w:t>spaCy</w:t>
+      </w:r>
+      <w:proofErr w:type="spellEnd"/>
+      <w:r>
+        <w:t xml:space="preserve"> and regex</w:t>
+      </w:r>
+    </w:p>
+    <w:p>
+      <w:r>
+        <w:t>for KYC documents.</w:t>
       </w:r>
     </w:p>
     <w:p/>
     <w:p>
       <w:r>
-        <w:t>1. Implement Customer Onboarding:</w:t>
-      </w:r>
-    </w:p>
-    <w:p>
-      <w:r>
-        <w:t xml:space="preserve">   - Capture customer profile (Name, DOB, Address).</w:t>
-      </w:r>
-    </w:p>
-    <w:p>
-      <w:r>
-        <w:t xml:space="preserve">   - Upload KYC documents (PAN, Aadhaar, Passport).</w:t>
-      </w:r>
-    </w:p>
-    <w:p>
-      <w:r>
-        <w:t xml:space="preserve">   - Store cases in MongoDB.</w:t>
-      </w:r>
-    </w:p>
-    <w:p>
-      <w:r>
-        <w:t xml:space="preserve">   - Each onboarding case is created by a MAKER user.</w:t>
+        <w:t>Entities:</w:t>
+      </w:r>
+    </w:p>
+    <w:p>
+      <w:r>
+        <w:t>- Name</w:t>
+      </w:r>
+    </w:p>
+    <w:p>
+      <w:r>
+        <w:t>- Date of Birth</w:t>
+      </w:r>
+    </w:p>
+    <w:p>
+      <w:r>
+        <w:t>- Address</w:t>
+      </w:r>
+    </w:p>
+    <w:p>
+      <w:r>
+        <w:t>- PAN / Aadhaar number</w:t>
       </w:r>
     </w:p>
     <w:p/>
     <w:p>
       <w:r>
-        <w:t>2. Implement Role-Based Access Control:</w:t>
-      </w:r>
-    </w:p>
-    <w:p>
-      <w:r>
-        <w:t xml:space="preserve">   - Roles: MAKER, CHECKER.</w:t>
-      </w:r>
-    </w:p>
-    <w:p>
-      <w:r>
-        <w:t xml:space="preserve">   - MAKER can create and submit KYC cases.</w:t>
-      </w:r>
-    </w:p>
-    <w:p>
-      <w:r>
-        <w:t xml:space="preserve">   - CHECKER can review, approve, or reject cases.</w:t>
-      </w:r>
-    </w:p>
-    <w:p>
-      <w:r>
-        <w:t xml:space="preserve">   - Enforce segregation of duties.</w:t>
-      </w:r>
-    </w:p>
-    <w:p/>
-    <w:p>
-      <w:r>
-        <w:t>3. Implement Lightweight Workflow Engine:</w:t>
-      </w:r>
-    </w:p>
-    <w:p>
-      <w:r>
-        <w:t xml:space="preserve">   - Case states:</w:t>
-      </w:r>
-    </w:p>
-    <w:p>
-      <w:r>
-        <w:t xml:space="preserve">     DRAFT → SUBMITTED → AI_REVIEWED → CHECKER_APPROVED / CHECKER_REJECTED</w:t>
-      </w:r>
-    </w:p>
-    <w:p>
-      <w:r>
-        <w:t xml:space="preserve">   - Validate state transitions based on role and action.</w:t>
-      </w:r>
-    </w:p>
-    <w:p>
-      <w:r>
-        <w:t xml:space="preserve">   - Maintain an audit trail for all state changes.</w:t>
-      </w:r>
-    </w:p>
-    <w:p/>
-    <w:p>
-      <w:r>
-        <w:t>4. OCR &amp; Document Processing:</w:t>
-      </w:r>
-    </w:p>
-    <w:p>
-      <w:r>
-        <w:lastRenderedPageBreak/>
-        <w:t xml:space="preserve">   - Extract text from uploaded documents using </w:t>
-      </w:r>
-      <w:proofErr w:type="spellStart"/>
-      <w:r>
-        <w:t>PaddleOCR</w:t>
-      </w:r>
-      <w:proofErr w:type="spellEnd"/>
-      <w:r>
-        <w:t>.</w:t>
-      </w:r>
-    </w:p>
-    <w:p>
-      <w:r>
-        <w:t xml:space="preserve">   - Support scanned and photographed documents.</w:t>
-      </w:r>
-    </w:p>
-    <w:p/>
-    <w:p>
-      <w:r>
-        <w:t>5. NLP &amp; Entity Extraction:</w:t>
-      </w:r>
-    </w:p>
-    <w:p>
-      <w:r>
-        <w:t xml:space="preserve">   - Extract Name, Date of Birth, Address, PAN/Aadhaar using </w:t>
-      </w:r>
-      <w:proofErr w:type="spellStart"/>
-      <w:r>
-        <w:t>spaCy</w:t>
-      </w:r>
-      <w:proofErr w:type="spellEnd"/>
-      <w:r>
-        <w:t xml:space="preserve"> and Regex.</w:t>
-      </w:r>
-    </w:p>
-    <w:p/>
-    <w:p>
-      <w:r>
-        <w:t>6. Validation &amp; Risk Scoring:</w:t>
-      </w:r>
-    </w:p>
-    <w:p>
-      <w:r>
-        <w:t xml:space="preserve">   - Compare extracted fields with onboarding data.</w:t>
-      </w:r>
-    </w:p>
-    <w:p>
-      <w:r>
-        <w:t xml:space="preserve">   - Calculate a rule-based KYC risk score.</w:t>
-      </w:r>
-    </w:p>
-    <w:p>
-      <w:r>
-        <w:t xml:space="preserve">   - Detect anomalies (missing or inconsistent data).</w:t>
-      </w:r>
-    </w:p>
-    <w:p/>
-    <w:p>
-      <w:r>
-        <w:t>7. RAG-Based Compliance Engine:</w:t>
-      </w:r>
-    </w:p>
-    <w:p>
-      <w:r>
-        <w:t xml:space="preserve">   - Ingest RBI KYC Master Direction documents.</w:t>
-      </w:r>
-    </w:p>
-    <w:p>
-      <w:r>
-        <w:t xml:space="preserve">   - Use </w:t>
-      </w:r>
-      <w:proofErr w:type="spellStart"/>
-      <w:r>
-        <w:t>SentenceTransformers</w:t>
-      </w:r>
-      <w:proofErr w:type="spellEnd"/>
-      <w:r>
-        <w:t xml:space="preserve"> for embeddings.</w:t>
-      </w:r>
-    </w:p>
-    <w:p>
-      <w:r>
-        <w:t xml:space="preserve">   - Store vectors in FAISS.</w:t>
-      </w:r>
-    </w:p>
-    <w:p>
-      <w:r>
-        <w:t xml:space="preserve">   - Retrieve relevant compliance rules using </w:t>
-      </w:r>
-      <w:proofErr w:type="spellStart"/>
-      <w:r>
-        <w:t>LangChain</w:t>
-      </w:r>
-      <w:proofErr w:type="spellEnd"/>
-      <w:r>
-        <w:t>.</w:t>
-      </w:r>
-    </w:p>
-    <w:p/>
-    <w:p>
-      <w:r>
-        <w:t>8. GenAI Decision Explanation:</w:t>
-      </w:r>
-    </w:p>
-    <w:p>
-      <w:r>
-        <w:t xml:space="preserve">   - Use an open-source LLM (Llama / Mistral / Gemma via </w:t>
-      </w:r>
-      <w:proofErr w:type="spellStart"/>
-      <w:r>
-        <w:t>HuggingFace</w:t>
-      </w:r>
-      <w:proofErr w:type="spellEnd"/>
-      <w:r>
-        <w:t>).</w:t>
-      </w:r>
-    </w:p>
-    <w:p>
-      <w:r>
-        <w:t xml:space="preserve">   - Generate explainable AI reasoning for approval or rejection.</w:t>
-      </w:r>
-    </w:p>
-    <w:p/>
-    <w:p>
-      <w:r>
-        <w:t>9. Backend API:</w:t>
-      </w:r>
-    </w:p>
-    <w:p>
-      <w:r>
-        <w:t xml:space="preserve">   - Build REST APIs using </w:t>
-      </w:r>
-      <w:proofErr w:type="spellStart"/>
-      <w:r>
-        <w:t>FastAPI</w:t>
-      </w:r>
-      <w:proofErr w:type="spellEnd"/>
-      <w:r>
-        <w:t>.</w:t>
-      </w:r>
-    </w:p>
-    <w:p>
-      <w:r>
-        <w:t xml:space="preserve">   - Use MongoDB for persistence.</w:t>
-      </w:r>
-    </w:p>
-    <w:p>
-      <w:r>
-        <w:t xml:space="preserve">   - Modular, service-based architecture.</w:t>
-      </w:r>
-    </w:p>
-    <w:p>
-      <w:r>
-        <w:t xml:space="preserve">   - Environment variable support.</w:t>
-      </w:r>
-    </w:p>
-    <w:p>
-      <w:r>
-        <w:lastRenderedPageBreak/>
-        <w:t xml:space="preserve">   - Error handling and logging.</w:t>
-      </w:r>
-    </w:p>
-    <w:p/>
-    <w:p>
-      <w:r>
-        <w:t>===============================</w:t>
-      </w:r>
-    </w:p>
-    <w:p>
-      <w:r>
-        <w:t>FRONTEND REQUIREMENTS (REACT)</w:t>
-      </w:r>
-    </w:p>
-    <w:p>
-      <w:r>
-        <w:t>===============================</w:t>
-      </w:r>
-    </w:p>
-    <w:p/>
-    <w:p>
-      <w:r>
-        <w:t>- React frontend with:</w:t>
-      </w:r>
-    </w:p>
-    <w:p>
-      <w:r>
-        <w:t xml:space="preserve">  - Login screen (Maker / Checker).</w:t>
-      </w:r>
-    </w:p>
-    <w:p>
-      <w:r>
-        <w:t xml:space="preserve">  - Maker dashboard:</w:t>
-      </w:r>
-    </w:p>
-    <w:p>
-      <w:r>
-        <w:t xml:space="preserve">    - Create KYC case.</w:t>
-      </w:r>
-    </w:p>
-    <w:p>
-      <w:r>
-        <w:t xml:space="preserve">    - Upload documents.</w:t>
-      </w:r>
-    </w:p>
-    <w:p>
-      <w:r>
-        <w:t xml:space="preserve">    - Submit case for review.</w:t>
-      </w:r>
-    </w:p>
-    <w:p>
-      <w:r>
-        <w:t xml:space="preserve">    - View case status.</w:t>
-      </w:r>
-    </w:p>
-    <w:p>
-      <w:r>
-        <w:t xml:space="preserve">  - Checker dashboard:</w:t>
-      </w:r>
-    </w:p>
-    <w:p>
-      <w:r>
-        <w:t xml:space="preserve">    - View submitted cases.</w:t>
-      </w:r>
-    </w:p>
-    <w:p>
-      <w:r>
-        <w:t xml:space="preserve">    - Review AI-extracted data.</w:t>
-      </w:r>
-    </w:p>
-    <w:p>
-      <w:r>
-        <w:t xml:space="preserve">    - View risk score and GenAI explanation.</w:t>
-      </w:r>
-    </w:p>
-    <w:p>
-      <w:r>
-        <w:t xml:space="preserve">    - Approve or reject cases.</w:t>
-      </w:r>
-    </w:p>
-    <w:p>
-      <w:r>
-        <w:t xml:space="preserve">  - Status tracking and audit history.</w:t>
-      </w:r>
-    </w:p>
-    <w:p/>
-    <w:p>
-      <w:r>
-        <w:t>===============================</w:t>
-      </w:r>
-    </w:p>
-    <w:p>
-      <w:r>
-        <w:t>TECH STACK (STRICT)</w:t>
-      </w:r>
-    </w:p>
-    <w:p>
-      <w:r>
-        <w:t>===============================</w:t>
-      </w:r>
-    </w:p>
-    <w:p/>
-    <w:p>
-      <w:r>
-        <w:t xml:space="preserve">OCR: </w:t>
-      </w:r>
-      <w:proofErr w:type="spellStart"/>
-      <w:r>
-        <w:t>PaddleOCR</w:t>
-      </w:r>
-      <w:proofErr w:type="spellEnd"/>
-      <w:r>
-        <w:t xml:space="preserve">  </w:t>
-      </w:r>
-    </w:p>
-    <w:p>
-      <w:r>
-        <w:t xml:space="preserve">NLP: </w:t>
-      </w:r>
-      <w:proofErr w:type="spellStart"/>
-      <w:r>
-        <w:t>spaCy</w:t>
-      </w:r>
-      <w:proofErr w:type="spellEnd"/>
-      <w:r>
-        <w:t xml:space="preserve">, Regex  </w:t>
-      </w:r>
-    </w:p>
-    <w:p>
-      <w:r>
-        <w:lastRenderedPageBreak/>
-        <w:t xml:space="preserve">Embeddings: </w:t>
-      </w:r>
-      <w:proofErr w:type="spellStart"/>
-      <w:r>
-        <w:t>SentenceTransformers</w:t>
-      </w:r>
-      <w:proofErr w:type="spellEnd"/>
-      <w:r>
-        <w:t xml:space="preserve">  </w:t>
-      </w:r>
-    </w:p>
-    <w:p>
-      <w:r>
-        <w:t xml:space="preserve">Vector DB: FAISS  </w:t>
-      </w:r>
-    </w:p>
-    <w:p>
-      <w:r>
-        <w:t xml:space="preserve">LLM: </w:t>
-      </w:r>
-      <w:proofErr w:type="spellStart"/>
-      <w:r>
-        <w:t>HuggingFace</w:t>
-      </w:r>
-      <w:proofErr w:type="spellEnd"/>
-      <w:r>
-        <w:t xml:space="preserve"> (Llama / Mistral / Gemma)  </w:t>
-      </w:r>
-    </w:p>
-    <w:p>
-      <w:r>
-        <w:t xml:space="preserve">RAG: </w:t>
-      </w:r>
-      <w:proofErr w:type="spellStart"/>
-      <w:r>
-        <w:t>LangChain</w:t>
-      </w:r>
-      <w:proofErr w:type="spellEnd"/>
-      <w:r>
-        <w:t xml:space="preserve">  </w:t>
-      </w:r>
-    </w:p>
-    <w:p>
-      <w:r>
-        <w:t xml:space="preserve">Backend: </w:t>
-      </w:r>
-      <w:proofErr w:type="spellStart"/>
-      <w:r>
-        <w:t>FastAPI</w:t>
-      </w:r>
-      <w:proofErr w:type="spellEnd"/>
-      <w:r>
-        <w:t xml:space="preserve">  </w:t>
-      </w:r>
-    </w:p>
-    <w:p>
-      <w:r>
-        <w:t xml:space="preserve">Frontend: React  </w:t>
-      </w:r>
-    </w:p>
-    <w:p>
-      <w:r>
-        <w:t xml:space="preserve">Database: MongoDB  </w:t>
-      </w:r>
-    </w:p>
-    <w:p/>
-    <w:p>
-      <w:r>
-        <w:t>===============================</w:t>
-      </w:r>
-    </w:p>
-    <w:p>
-      <w:r>
-        <w:t>DELIVERABLES</w:t>
-      </w:r>
-    </w:p>
-    <w:p>
-      <w:r>
-        <w:t>===============================</w:t>
-      </w:r>
-    </w:p>
-    <w:p/>
-    <w:p>
-      <w:r>
-        <w:t>1. Complete project folder structure.</w:t>
-      </w:r>
-    </w:p>
-    <w:p>
-      <w:r>
-        <w:t>2. Starter code for:</w:t>
-      </w:r>
-    </w:p>
-    <w:p>
-      <w:r>
-        <w:t xml:space="preserve">   - Authentication &amp; role management</w:t>
-      </w:r>
-    </w:p>
-    <w:p>
-      <w:r>
-        <w:t xml:space="preserve">   - Onboarding module</w:t>
-      </w:r>
-    </w:p>
-    <w:p>
-      <w:r>
-        <w:t xml:space="preserve">   - Workflow engine</w:t>
-      </w:r>
-    </w:p>
-    <w:p>
-      <w:r>
-        <w:t xml:space="preserve">   - OCR module</w:t>
-      </w:r>
-    </w:p>
-    <w:p>
-      <w:r>
-        <w:t xml:space="preserve">   - NLP entity extraction</w:t>
-      </w:r>
-    </w:p>
-    <w:p>
-      <w:r>
-        <w:t xml:space="preserve">   - Risk scoring</w:t>
-      </w:r>
-    </w:p>
-    <w:p>
-      <w:r>
-        <w:t xml:space="preserve">   - RAG compliance engine</w:t>
-      </w:r>
-    </w:p>
-    <w:p>
-      <w:r>
-        <w:t xml:space="preserve">   - GenAI explanation</w:t>
-      </w:r>
-    </w:p>
-    <w:p>
-      <w:r>
-        <w:t xml:space="preserve">   - MongoDB persistence</w:t>
-      </w:r>
-    </w:p>
-    <w:p>
-      <w:r>
-        <w:t>3. React component structure for Maker and Checker dashboards.</w:t>
-      </w:r>
-    </w:p>
-    <w:p>
-      <w:r>
-        <w:t>4. API contracts between frontend and backend.</w:t>
-      </w:r>
-    </w:p>
-    <w:p>
-      <w:r>
-        <w:t>5. Clear comments explaining each module.</w:t>
-      </w:r>
-    </w:p>
-    <w:p>
-      <w:r>
-        <w:lastRenderedPageBreak/>
-        <w:t>6. Code written in a clean, readable, college-safe manner.</w:t>
-      </w:r>
-    </w:p>
-    <w:p/>
-    <w:p>
-      <w:r>
-        <w:t>Start by generating the full folder structure first then backend and then frontend.</w:t>
-      </w:r>
-    </w:p>
-    <w:p>
-      <w:r>
-        <w:t>Also provide starter code for each module.</w:t>
-      </w:r>
-    </w:p>
-    <w:p>
-      <w:r>
-        <w:t>https://chatgpt.com/c/6942a999-f1c4-8331-be98-65db16d32615</w:t>
+        <w:t>Input: OCR text</w:t>
+      </w:r>
+    </w:p>
+    <w:p>
+      <w:r>
+        <w:t>Output: structured JSON</w:t>
       </w:r>
     </w:p>
     <w:p/>
     <w:p/>
     <w:p>
       <w:r>
-        <w:t>********</w:t>
-      </w:r>
-    </w:p>
-    <w:p>
-      <w:r>
         <w:rPr>
           <w:rFonts w:ascii="Segoe UI Emoji" w:hAnsi="Segoe UI Emoji" w:cs="Segoe UI Emoji"/>
         </w:rPr>
-        <w:t>👥</w:t>
-      </w:r>
-      <w:r>
-        <w:t xml:space="preserve"> TEAM SPLIT (IMPORTANT)</w:t>
-      </w:r>
-    </w:p>
-    <w:p>
-      <w:r>
-        <w:t>Member</w:t>
-      </w:r>
-      <w:r>
-        <w:tab/>
-        <w:t>Responsibility</w:t>
-      </w:r>
-    </w:p>
-    <w:p>
-      <w:r>
-        <w:t>Member 1</w:t>
-      </w:r>
-      <w:r>
-        <w:tab/>
-        <w:t>OCR + NLP</w:t>
-      </w:r>
-    </w:p>
-    <w:p>
-      <w:r>
-        <w:t>Member 2</w:t>
-      </w:r>
-      <w:r>
-        <w:tab/>
-        <w:t>Onboarding + Workflow + Risk</w:t>
-      </w:r>
-    </w:p>
-    <w:p>
-      <w:r>
-        <w:t>Member 3</w:t>
-      </w:r>
-      <w:r>
-        <w:tab/>
-        <w:t>RAG + GenAI + React</w:t>
+        <w:t>👉</w:t>
+      </w:r>
+      <w:r>
+        <w:t xml:space="preserve"> Commit as </w:t>
+      </w:r>
+      <w:proofErr w:type="spellStart"/>
+      <w:r>
+        <w:t>ocr</w:t>
+      </w:r>
+      <w:proofErr w:type="spellEnd"/>
+      <w:r>
+        <w:t>-</w:t>
+      </w:r>
+      <w:proofErr w:type="spellStart"/>
+      <w:r>
+        <w:t>nlp</w:t>
+      </w:r>
+      <w:proofErr w:type="spellEnd"/>
+      <w:r>
+        <w:t>-module</w:t>
       </w:r>
     </w:p>
     <w:p/>
     <w:p>
       <w:r>
-        <w:t>Each member creates their own GitHub branch.</w:t>
+        <w:rPr>
+          <w:rFonts w:ascii="Segoe UI Emoji" w:hAnsi="Segoe UI Emoji" w:cs="Segoe UI Emoji"/>
+        </w:rPr>
+        <w:t>👤</w:t>
+      </w:r>
+      <w:r>
+        <w:t xml:space="preserve"> MEMBER 2 PROMPTS (Onboarding + Workflow + Risk)</w:t>
+      </w:r>
+    </w:p>
+    <w:p>
+      <w:r>
+        <w:rPr>
+          <w:rFonts w:ascii="Segoe UI Emoji" w:hAnsi="Segoe UI Emoji" w:cs="Segoe UI Emoji"/>
+        </w:rPr>
+        <w:t>🔹</w:t>
+      </w:r>
+      <w:r>
+        <w:t xml:space="preserve"> Prompt 3A – Customer Onboarding</w:t>
+      </w:r>
+    </w:p>
+    <w:p>
+      <w:r>
+        <w:t xml:space="preserve">Implement a customer onboarding module in </w:t>
+      </w:r>
+      <w:proofErr w:type="spellStart"/>
+      <w:r>
+        <w:t>FastAPI</w:t>
+      </w:r>
+      <w:proofErr w:type="spellEnd"/>
+      <w:r>
+        <w:t>.</w:t>
       </w:r>
     </w:p>
     <w:p/>
     <w:p>
       <w:r>
+        <w:t>Features:</w:t>
+      </w:r>
+    </w:p>
+    <w:p>
+      <w:r>
+        <w:lastRenderedPageBreak/>
+        <w:t>- Create KYC case</w:t>
+      </w:r>
+    </w:p>
+    <w:p>
+      <w:r>
+        <w:t>- Store customer details</w:t>
+      </w:r>
+    </w:p>
+    <w:p>
+      <w:r>
+        <w:t>- Upload documents</w:t>
+      </w:r>
+    </w:p>
+    <w:p>
+      <w:r>
+        <w:t>- Associate case with MAKER user</w:t>
+      </w:r>
+    </w:p>
+    <w:p>
+      <w:r>
+        <w:t>- Save data in MongoDB</w:t>
+      </w:r>
+    </w:p>
+    <w:p/>
+    <w:p>
+      <w:r>
         <w:rPr>
           <w:rFonts w:ascii="Segoe UI Emoji" w:hAnsi="Segoe UI Emoji" w:cs="Segoe UI Emoji"/>
         </w:rPr>
-        <w:t>👤</w:t>
-      </w:r>
-      <w:r>
-        <w:t xml:space="preserve"> MEMBER 1 PROMPTS (OCR + NLP)</w:t>
-      </w:r>
-    </w:p>
+        <w:t>🔹</w:t>
+      </w:r>
+      <w:r>
+        <w:t xml:space="preserve"> Prompt 3B – Workflow Engine</w:t>
+      </w:r>
+    </w:p>
+    <w:p>
+      <w:r>
+        <w:t>Implement a simple maker-checker workflow engine.</w:t>
+      </w:r>
+    </w:p>
+    <w:p/>
+    <w:p>
+      <w:r>
+        <w:t>States:</w:t>
+      </w:r>
+    </w:p>
+    <w:p>
+      <w:r>
+        <w:t>DRAFT → SUBMITTED → AI_REVIEWED → APPROVED / REJECTED</w:t>
+      </w:r>
+    </w:p>
+    <w:p/>
+    <w:p>
+      <w:r>
+        <w:t>Rules:</w:t>
+      </w:r>
+    </w:p>
+    <w:p>
+      <w:r>
+        <w:t>- Maker submits</w:t>
+      </w:r>
+    </w:p>
+    <w:p>
+      <w:r>
+        <w:t>- Checker approves/rejects</w:t>
+      </w:r>
+    </w:p>
+    <w:p>
+      <w:r>
+        <w:t>- Validate transitions</w:t>
+      </w:r>
+    </w:p>
+    <w:p>
+      <w:r>
+        <w:t>- Log actions</w:t>
+      </w:r>
+    </w:p>
+    <w:p/>
     <w:p>
       <w:r>
         <w:rPr>
@@ -6331,129 +6143,33 @@
         <w:t>🔹</w:t>
       </w:r>
       <w:r>
-        <w:t xml:space="preserve"> Prompt 2A – OCR Module</w:t>
-      </w:r>
-    </w:p>
-    <w:p>
-      <w:r>
-        <w:t xml:space="preserve">Implement a backend OCR module using </w:t>
-      </w:r>
-      <w:proofErr w:type="spellStart"/>
-      <w:r>
-        <w:t>PaddleOCR</w:t>
-      </w:r>
-      <w:proofErr w:type="spellEnd"/>
-    </w:p>
-    <w:p>
-      <w:r>
-        <w:t xml:space="preserve">inside the existing </w:t>
-      </w:r>
-      <w:proofErr w:type="spellStart"/>
-      <w:r>
-        <w:t>FastAPI</w:t>
-      </w:r>
-      <w:proofErr w:type="spellEnd"/>
-      <w:r>
-        <w:t xml:space="preserve"> project.</w:t>
+        <w:t xml:space="preserve"> Prompt 3C – Risk Scoring</w:t>
+      </w:r>
+    </w:p>
+    <w:p>
+      <w:r>
+        <w:t>Implement a rule-based KYC risk scoring module.</w:t>
       </w:r>
     </w:p>
     <w:p/>
     <w:p>
       <w:r>
-        <w:t>Requirements:</w:t>
-      </w:r>
-    </w:p>
-    <w:p>
-      <w:r>
-        <w:t>- Accept image/PDF uploads</w:t>
-      </w:r>
-    </w:p>
-    <w:p>
-      <w:r>
-        <w:t>- Extract raw text</w:t>
-      </w:r>
-    </w:p>
-    <w:p>
-      <w:r>
-        <w:t>- Return structured JSON</w:t>
-      </w:r>
-    </w:p>
-    <w:p>
-      <w:r>
-        <w:t>- No frontend code</w:t>
-      </w:r>
-    </w:p>
-    <w:p>
-      <w:r>
-        <w:lastRenderedPageBreak/>
-        <w:t>- Add clear comments</w:t>
-      </w:r>
-    </w:p>
-    <w:p/>
-    <w:p>
-      <w:r>
-        <w:rPr>
-          <w:rFonts w:ascii="Segoe UI Emoji" w:hAnsi="Segoe UI Emoji" w:cs="Segoe UI Emoji"/>
-        </w:rPr>
-        <w:t>🔹</w:t>
-      </w:r>
-      <w:r>
-        <w:t xml:space="preserve"> Prompt 2B – NLP Module</w:t>
-      </w:r>
-    </w:p>
-    <w:p>
-      <w:r>
-        <w:t xml:space="preserve">Implement entity extraction using </w:t>
-      </w:r>
-      <w:proofErr w:type="spellStart"/>
-      <w:r>
-        <w:t>spaCy</w:t>
-      </w:r>
-      <w:proofErr w:type="spellEnd"/>
-      <w:r>
-        <w:t xml:space="preserve"> and regex</w:t>
-      </w:r>
-    </w:p>
-    <w:p>
-      <w:r>
-        <w:t>for KYC documents.</w:t>
-      </w:r>
-    </w:p>
-    <w:p/>
-    <w:p>
-      <w:r>
-        <w:t>Entities:</w:t>
-      </w:r>
-    </w:p>
-    <w:p>
-      <w:r>
-        <w:t>- Name</w:t>
-      </w:r>
-    </w:p>
-    <w:p>
-      <w:r>
-        <w:t>- Date of Birth</w:t>
-      </w:r>
-    </w:p>
-    <w:p>
-      <w:r>
-        <w:t>- Address</w:t>
-      </w:r>
-    </w:p>
-    <w:p>
-      <w:r>
-        <w:t>- PAN / Aadhaar number</w:t>
-      </w:r>
-    </w:p>
-    <w:p/>
-    <w:p>
-      <w:r>
-        <w:t>Input: OCR text</w:t>
-      </w:r>
-    </w:p>
-    <w:p>
-      <w:r>
-        <w:t>Output: structured JSON</w:t>
+        <w:t>Rules:</w:t>
+      </w:r>
+    </w:p>
+    <w:p>
+      <w:r>
+        <w:t>- Missing fields increase risk</w:t>
+      </w:r>
+    </w:p>
+    <w:p>
+      <w:r>
+        <w:t>- Mismatch increases risk</w:t>
+      </w:r>
+    </w:p>
+    <w:p>
+      <w:r>
+        <w:t>- Output numeric risk score and category</w:t>
       </w:r>
     </w:p>
     <w:p/>
@@ -6466,24 +6182,80 @@
         <w:t>👉</w:t>
       </w:r>
       <w:r>
-        <w:t xml:space="preserve"> Commit as </w:t>
+        <w:t xml:space="preserve"> Commit as onboarding-workflow-risk</w:t>
+      </w:r>
+    </w:p>
+    <w:p/>
+    <w:p>
+      <w:r>
+        <w:rPr>
+          <w:rFonts w:ascii="Segoe UI Emoji" w:hAnsi="Segoe UI Emoji" w:cs="Segoe UI Emoji"/>
+        </w:rPr>
+        <w:t>👤</w:t>
+      </w:r>
+      <w:r>
+        <w:t xml:space="preserve"> MEMBER 3 PROMPTS (RAG + GenAI + React)</w:t>
+      </w:r>
+    </w:p>
+    <w:p>
+      <w:r>
+        <w:rPr>
+          <w:rFonts w:ascii="Segoe UI Emoji" w:hAnsi="Segoe UI Emoji" w:cs="Segoe UI Emoji"/>
+        </w:rPr>
+        <w:t>🔹</w:t>
+      </w:r>
+      <w:r>
+        <w:t xml:space="preserve"> Prompt 4A – RAG Compliance Engine</w:t>
+      </w:r>
+    </w:p>
+    <w:p>
+      <w:r>
+        <w:t xml:space="preserve">Implement </w:t>
+      </w:r>
+      <w:proofErr w:type="gramStart"/>
+      <w:r>
+        <w:t>a RAG</w:t>
+      </w:r>
+      <w:proofErr w:type="gramEnd"/>
+      <w:r>
+        <w:t>-based compliance engine.</w:t>
+      </w:r>
+    </w:p>
+    <w:p/>
+    <w:p>
+      <w:r>
+        <w:t>Requirements:</w:t>
+      </w:r>
+    </w:p>
+    <w:p>
+      <w:r>
+        <w:t>- Load RBI KYC documents</w:t>
+      </w:r>
+    </w:p>
+    <w:p>
+      <w:r>
+        <w:t xml:space="preserve">- Create embeddings using </w:t>
       </w:r>
       <w:proofErr w:type="spellStart"/>
       <w:r>
-        <w:t>ocr</w:t>
+        <w:t>SentenceTransformers</w:t>
       </w:r>
       <w:proofErr w:type="spellEnd"/>
-      <w:r>
-        <w:t>-</w:t>
+    </w:p>
+    <w:p>
+      <w:r>
+        <w:t>- Store vectors in FAISS</w:t>
+      </w:r>
+    </w:p>
+    <w:p>
+      <w:r>
+        <w:t xml:space="preserve">- Retrieve relevant rules using </w:t>
       </w:r>
       <w:proofErr w:type="spellStart"/>
       <w:r>
-        <w:t>nlp</w:t>
+        <w:t>LangChain</w:t>
       </w:r>
       <w:proofErr w:type="spellEnd"/>
-      <w:r>
-        <w:t>-module</w:t>
-      </w:r>
     </w:p>
     <w:p/>
     <w:p>
@@ -6491,334 +6263,88 @@
         <w:rPr>
           <w:rFonts w:ascii="Segoe UI Emoji" w:hAnsi="Segoe UI Emoji" w:cs="Segoe UI Emoji"/>
         </w:rPr>
-        <w:t>👤</w:t>
-      </w:r>
-      <w:r>
-        <w:t xml:space="preserve"> MEMBER 2 PROMPTS (Onboarding + Workflow + Risk)</w:t>
-      </w:r>
-    </w:p>
+        <w:t>🔹</w:t>
+      </w:r>
+      <w:r>
+        <w:t xml:space="preserve"> Prompt 4B – GenAI Explanation</w:t>
+      </w:r>
+    </w:p>
+    <w:p>
+      <w:r>
+        <w:t>Implement a GenAI explanation module using</w:t>
+      </w:r>
+    </w:p>
+    <w:p>
+      <w:r>
+        <w:t xml:space="preserve">an open-source </w:t>
+      </w:r>
+      <w:proofErr w:type="spellStart"/>
+      <w:r>
+        <w:t>HuggingFace</w:t>
+      </w:r>
+      <w:proofErr w:type="spellEnd"/>
+      <w:r>
+        <w:t xml:space="preserve"> LLM.</w:t>
+      </w:r>
+    </w:p>
+    <w:p/>
+    <w:p>
+      <w:r>
+        <w:t>Input:</w:t>
+      </w:r>
+    </w:p>
+    <w:p>
+      <w:r>
+        <w:t>- Extracted KYC data</w:t>
+      </w:r>
+    </w:p>
+    <w:p>
+      <w:r>
+        <w:t>- Risk score</w:t>
+      </w:r>
+    </w:p>
+    <w:p>
+      <w:r>
+        <w:t>- Retrieved compliance rules</w:t>
+      </w:r>
+    </w:p>
+    <w:p/>
+    <w:p>
+      <w:r>
+        <w:t>Output:</w:t>
+      </w:r>
+    </w:p>
+    <w:p>
+      <w:r>
+        <w:t>- Human-readable approval/rejection explanation</w:t>
+      </w:r>
+    </w:p>
+    <w:p/>
     <w:p>
       <w:r>
         <w:rPr>
           <w:rFonts w:ascii="Segoe UI Emoji" w:hAnsi="Segoe UI Emoji" w:cs="Segoe UI Emoji"/>
         </w:rPr>
+        <w:lastRenderedPageBreak/>
         <w:t>🔹</w:t>
       </w:r>
       <w:r>
-        <w:t xml:space="preserve"> Prompt 3A – Customer Onboarding</w:t>
-      </w:r>
-    </w:p>
-    <w:p>
-      <w:r>
-        <w:t xml:space="preserve">Implement a customer onboarding module in </w:t>
-      </w:r>
-      <w:proofErr w:type="spellStart"/>
-      <w:r>
-        <w:t>FastAPI</w:t>
-      </w:r>
-      <w:proofErr w:type="spellEnd"/>
-      <w:r>
-        <w:t>.</w:t>
+        <w:t xml:space="preserve"> Prompt 4C – React Frontend (SEPARATE REPL)</w:t>
+      </w:r>
+    </w:p>
+    <w:p>
+      <w:r>
+        <w:t>Create a React frontend for a KYC onboarding system.</w:t>
       </w:r>
     </w:p>
     <w:p/>
     <w:p>
       <w:r>
-        <w:t>Features:</w:t>
-      </w:r>
-    </w:p>
-    <w:p>
-      <w:r>
-        <w:t>- Create KYC case</w:t>
-      </w:r>
-    </w:p>
-    <w:p>
-      <w:r>
-        <w:t>- Store customer details</w:t>
-      </w:r>
-    </w:p>
-    <w:p>
-      <w:r>
-        <w:t>- Upload documents</w:t>
-      </w:r>
-    </w:p>
-    <w:p>
-      <w:r>
-        <w:lastRenderedPageBreak/>
-        <w:t>- Associate case with MAKER user</w:t>
-      </w:r>
-    </w:p>
-    <w:p>
-      <w:r>
-        <w:t>- Save data in MongoDB</w:t>
-      </w:r>
-    </w:p>
-    <w:p/>
-    <w:p>
-      <w:r>
-        <w:rPr>
-          <w:rFonts w:ascii="Segoe UI Emoji" w:hAnsi="Segoe UI Emoji" w:cs="Segoe UI Emoji"/>
-        </w:rPr>
-        <w:t>🔹</w:t>
-      </w:r>
-      <w:r>
-        <w:t xml:space="preserve"> Prompt 3B – Workflow Engine</w:t>
-      </w:r>
-    </w:p>
-    <w:p>
-      <w:r>
-        <w:t>Implement a simple maker-checker workflow engine.</w:t>
-      </w:r>
-    </w:p>
-    <w:p/>
-    <w:p>
-      <w:r>
-        <w:t>States:</w:t>
-      </w:r>
-    </w:p>
-    <w:p>
-      <w:r>
-        <w:t>DRAFT → SUBMITTED → AI_REVIEWED → APPROVED / REJECTED</w:t>
-      </w:r>
-    </w:p>
-    <w:p/>
-    <w:p>
-      <w:r>
-        <w:t>Rules:</w:t>
-      </w:r>
-    </w:p>
-    <w:p>
-      <w:r>
-        <w:t>- Maker submits</w:t>
-      </w:r>
-    </w:p>
-    <w:p>
-      <w:r>
-        <w:t>- Checker approves/rejects</w:t>
-      </w:r>
-    </w:p>
-    <w:p>
-      <w:r>
-        <w:t>- Validate transitions</w:t>
-      </w:r>
-    </w:p>
-    <w:p>
-      <w:r>
-        <w:t>- Log actions</w:t>
-      </w:r>
-    </w:p>
-    <w:p/>
-    <w:p>
-      <w:r>
-        <w:rPr>
-          <w:rFonts w:ascii="Segoe UI Emoji" w:hAnsi="Segoe UI Emoji" w:cs="Segoe UI Emoji"/>
-        </w:rPr>
-        <w:t>🔹</w:t>
-      </w:r>
-      <w:r>
-        <w:t xml:space="preserve"> Prompt 3C – Risk Scoring</w:t>
-      </w:r>
-    </w:p>
-    <w:p>
-      <w:r>
-        <w:t>Implement a rule-based KYC risk scoring module.</w:t>
-      </w:r>
-    </w:p>
-    <w:p/>
-    <w:p>
-      <w:r>
-        <w:t>Rules:</w:t>
-      </w:r>
-    </w:p>
-    <w:p>
-      <w:r>
-        <w:t>- Missing fields increase risk</w:t>
-      </w:r>
-    </w:p>
-    <w:p>
-      <w:r>
-        <w:t>- Mismatch increases risk</w:t>
-      </w:r>
-    </w:p>
-    <w:p>
-      <w:r>
-        <w:t>- Output numeric risk score and category</w:t>
-      </w:r>
-    </w:p>
-    <w:p/>
-    <w:p/>
-    <w:p>
-      <w:r>
-        <w:rPr>
-          <w:rFonts w:ascii="Segoe UI Emoji" w:hAnsi="Segoe UI Emoji" w:cs="Segoe UI Emoji"/>
-        </w:rPr>
-        <w:t>👉</w:t>
-      </w:r>
-      <w:r>
-        <w:t xml:space="preserve"> Commit as onboarding-workflow-risk</w:t>
-      </w:r>
-    </w:p>
-    <w:p/>
-    <w:p>
-      <w:r>
-        <w:rPr>
-          <w:rFonts w:ascii="Segoe UI Emoji" w:hAnsi="Segoe UI Emoji" w:cs="Segoe UI Emoji"/>
-        </w:rPr>
-        <w:lastRenderedPageBreak/>
-        <w:t>👤</w:t>
-      </w:r>
-      <w:r>
-        <w:t xml:space="preserve"> MEMBER 3 PROMPTS (RAG + GenAI + React)</w:t>
-      </w:r>
-    </w:p>
-    <w:p>
-      <w:r>
-        <w:rPr>
-          <w:rFonts w:ascii="Segoe UI Emoji" w:hAnsi="Segoe UI Emoji" w:cs="Segoe UI Emoji"/>
-        </w:rPr>
-        <w:t>🔹</w:t>
-      </w:r>
-      <w:r>
-        <w:t xml:space="preserve"> Prompt 4A – RAG Compliance Engine</w:t>
-      </w:r>
-    </w:p>
-    <w:p>
-      <w:r>
-        <w:t xml:space="preserve">Implement </w:t>
-      </w:r>
-      <w:proofErr w:type="gramStart"/>
-      <w:r>
-        <w:t>a RAG</w:t>
-      </w:r>
-      <w:proofErr w:type="gramEnd"/>
-      <w:r>
-        <w:t>-based compliance engine.</w:t>
-      </w:r>
-    </w:p>
-    <w:p/>
-    <w:p>
-      <w:r>
-        <w:t>Requirements:</w:t>
-      </w:r>
-    </w:p>
-    <w:p>
-      <w:r>
-        <w:t>- Load RBI KYC documents</w:t>
-      </w:r>
-    </w:p>
-    <w:p>
-      <w:r>
-        <w:t xml:space="preserve">- Create embeddings using </w:t>
-      </w:r>
-      <w:proofErr w:type="spellStart"/>
-      <w:r>
-        <w:t>SentenceTransformers</w:t>
-      </w:r>
-      <w:proofErr w:type="spellEnd"/>
-    </w:p>
-    <w:p>
-      <w:r>
-        <w:t>- Store vectors in FAISS</w:t>
-      </w:r>
-    </w:p>
-    <w:p>
-      <w:r>
-        <w:t xml:space="preserve">- Retrieve relevant rules using </w:t>
-      </w:r>
-      <w:proofErr w:type="spellStart"/>
-      <w:r>
-        <w:t>LangChain</w:t>
-      </w:r>
-      <w:proofErr w:type="spellEnd"/>
-    </w:p>
-    <w:p/>
-    <w:p>
-      <w:r>
-        <w:rPr>
-          <w:rFonts w:ascii="Segoe UI Emoji" w:hAnsi="Segoe UI Emoji" w:cs="Segoe UI Emoji"/>
-        </w:rPr>
-        <w:t>🔹</w:t>
-      </w:r>
-      <w:r>
-        <w:t xml:space="preserve"> Prompt 4B – GenAI Explanation</w:t>
-      </w:r>
-    </w:p>
-    <w:p>
-      <w:r>
-        <w:t>Implement a GenAI explanation module using</w:t>
-      </w:r>
-    </w:p>
-    <w:p>
-      <w:r>
-        <w:t xml:space="preserve">an open-source </w:t>
-      </w:r>
-      <w:proofErr w:type="spellStart"/>
-      <w:r>
-        <w:t>HuggingFace</w:t>
-      </w:r>
-      <w:proofErr w:type="spellEnd"/>
-      <w:r>
-        <w:t xml:space="preserve"> LLM.</w:t>
-      </w:r>
-    </w:p>
-    <w:p/>
-    <w:p>
-      <w:r>
-        <w:t>Input:</w:t>
-      </w:r>
-    </w:p>
-    <w:p>
-      <w:r>
-        <w:t>- Extracted KYC data</w:t>
-      </w:r>
-    </w:p>
-    <w:p>
-      <w:r>
-        <w:t>- Risk score</w:t>
-      </w:r>
-    </w:p>
-    <w:p>
-      <w:r>
-        <w:t>- Retrieved compliance rules</w:t>
-      </w:r>
-    </w:p>
-    <w:p/>
-    <w:p>
-      <w:r>
-        <w:t>Output:</w:t>
-      </w:r>
-    </w:p>
-    <w:p>
-      <w:r>
-        <w:t>- Human-readable approval/rejection explanation</w:t>
-      </w:r>
-    </w:p>
-    <w:p/>
-    <w:p>
-      <w:r>
-        <w:rPr>
-          <w:rFonts w:ascii="Segoe UI Emoji" w:hAnsi="Segoe UI Emoji" w:cs="Segoe UI Emoji"/>
-        </w:rPr>
-        <w:t>🔹</w:t>
-      </w:r>
-      <w:r>
-        <w:t xml:space="preserve"> Prompt 4C – React Frontend (SEPARATE REPL)</w:t>
-      </w:r>
-    </w:p>
-    <w:p>
-      <w:r>
-        <w:t>Create a React frontend for a KYC onboarding system.</w:t>
-      </w:r>
-    </w:p>
-    <w:p/>
-    <w:p>
-      <w:r>
         <w:t>Screens:</w:t>
       </w:r>
     </w:p>
     <w:p>
       <w:r>
-        <w:lastRenderedPageBreak/>
         <w:t>- Login (Maker / Checker)</w:t>
       </w:r>
     </w:p>
@@ -13119,7 +12645,6 @@
   <w:style w:type="character" w:default="1" w:styleId="DefaultParagraphFont">
     <w:name w:val="Default Paragraph Font"/>
     <w:uiPriority w:val="1"/>
-    <w:semiHidden/>
     <w:unhideWhenUsed/>
   </w:style>
   <w:style w:type="table" w:default="1" w:styleId="TableNormal">

</xml_diff>